<commit_message>
Improvements made for readability and more comments included in the python source files and BRIEF.
</commit_message>
<xml_diff>
--- a/docs/design_plans_log.docx
+++ b/docs/design_plans_log.docx
@@ -238,6 +238,95 @@
       </w:r>
       <w:r>
         <w:t>No new warnings introduced. Pre-existing warnings: __init__.py re-exports (false positive), unused vars in fix_db.py/export_fixed.py (legacy), f-string issues in gen_psql.py/fix_db.py (legacy).</w:t>
+      </w:r>
+    </w:p>
+    <w:p/>
+    <w:p>
+      <w:r>
+        <w:rPr>
+          <w:b/>
+        </w:rPr>
+        <w:t>7. Graph Vehicle Information Box Enrichment</w:t>
+      </w:r>
+    </w:p>
+    <w:p>
+      <w:r>
+        <w:t>Decision: Expand the pyqtgraph annotation label on the outlier stat plot to display VIN, make, model, and manufacture date (mandate) in addition to the existing result, tolerance, and deviation.</w:t>
+      </w:r>
+    </w:p>
+    <w:p>
+      <w:r>
+        <w:t>Rationale: Quality engineers need immediate vehicle context when reviewing an outlier stat. Previously only the test name, result_y, tolerance bounds, and deviation were shown. The engineer had to cross-reference the VIN from the input field. Now the annotation includes:</w:t>
+      </w:r>
+    </w:p>
+    <w:p>
+      <w:r>
+        <w:t xml:space="preserve">  - VIN</w:t>
+      </w:r>
+    </w:p>
+    <w:p>
+      <w:r>
+        <w:t xml:space="preserve">  - Make and Model</w:t>
+      </w:r>
+    </w:p>
+    <w:p>
+      <w:r>
+        <w:t xml:space="preserve">  - Manufacture Date (mandate)</w:t>
+      </w:r>
+    </w:p>
+    <w:p>
+      <w:r>
+        <w:t>This reduces cognitive load and speeds up the analysis workflow, aligning with the industry-standard practice of embedding vehicle context directly on the plot (similar to JMP's "Row Legend" and Minitab's "Grouping" annotations).</w:t>
+      </w:r>
+    </w:p>
+    <w:p>
+      <w:r>
+        <w:t>Implementation:</w:t>
+      </w:r>
+    </w:p>
+    <w:p>
+      <w:r>
+        <w:t xml:space="preserve">  1. Modified build_outlier_query to JOIN vehicles table and SELECT make, model, manufacture_date.</w:t>
+      </w:r>
+    </w:p>
+    <w:p>
+      <w:r>
+        <w:t xml:space="preserve">  2. Modified build_outlier_query_by_vehicle to SELECT make, model, manufacture_date (JOIN already existed).</w:t>
+      </w:r>
+    </w:p>
+    <w:p>
+      <w:r>
+        <w:t xml:space="preserve">  3. Extended test_case.__init__ with optional make, model, mandate keyword arguments.</w:t>
+      </w:r>
+    </w:p>
+    <w:p>
+      <w:r>
+        <w:t xml:space="preserve">  4. Updated init_test_case to pass the new dict keys to test_case.</w:t>
+      </w:r>
+    </w:p>
+    <w:p>
+      <w:r>
+        <w:t xml:space="preserve">  5. Updated plot_selection annotation HTML to include a "VIN:" line formatted as: VIN: &lt;vin&gt;  |  &lt;make&gt; &lt;model&gt;  |  Man: &lt;date&gt;</w:t>
+      </w:r>
+    </w:p>
+    <w:p>
+      <w:r>
+        <w:t xml:space="preserve">  6. Updated all test helpers (_make_raw_row, _raw, _make_tc) to include the new fields.</w:t>
+      </w:r>
+    </w:p>
+    <w:p>
+      <w:r>
+        <w:t>Date: 2026-07-17</w:t>
+      </w:r>
+    </w:p>
+    <w:p>
+      <w:r>
+        <w:t>Version: 4.1.0 Beta</w:t>
+      </w:r>
+    </w:p>
+    <w:p>
+      <w:r>
+        <w:t>Tests: 109/109 passing (unit: 40, widget: 26, stress: 34) — pyflakes clean.</w:t>
       </w:r>
     </w:p>
     <w:sectPr>

</xml_diff>

<commit_message>
fix: correct column name spelling mismatches in config, SQL, and live databases
- fix(export_fixed.py): Dutch voertuigen column fabriekdatum->fabrieksdatum
- fix(export_fixed.py): 3 French stat column names corrected to match schema
- fix(ezsaw_tables_nl.sql): INSERT column fabriekdatum->fabrieksdatum
- fix(live DB ezsaw_nl): RENAME COLUMN fabriekdatum->fabrieksdatum
- fix(live DB ezsaw_fr): RENAME 3 misspelled stat columns
- fix(live DB ezsaw_es): RENAME ubicación puerta->ubicación_puerta
- fix(all live DBs): Add missing CHECK constraints for parity
- docs: update CHANGELOG.md, design_plans_log.docx for V4.2.0B
- version: bump 4.1.0 -> 4.2.0 across all locales
</commit_message>
<xml_diff>
--- a/docs/design_plans_log.docx
+++ b/docs/design_plans_log.docx
@@ -327,6 +327,190 @@
     <w:p>
       <w:r>
         <w:t>Tests: 109/109 passing (unit: 40, widget: 26, stress: 34) — pyflakes clean.</w:t>
+      </w:r>
+    </w:p>
+    <w:p>
+      <w:r>
+        <w:br w:type="page"/>
+      </w:r>
+    </w:p>
+    <w:p>
+      <w:pPr/>
+      <w:r>
+        <w:rPr>
+          <w:sz w:val="22"/>
+        </w:rPr>
+        <w:t>Date: 2026-07-20</w:t>
+      </w:r>
+    </w:p>
+    <w:p>
+      <w:pPr/>
+      <w:r>
+        <w:rPr>
+          <w:b/>
+          <w:sz w:val="22"/>
+        </w:rPr>
+        <w:t>Version: 4.2.0 Beta</w:t>
+      </w:r>
+    </w:p>
+    <w:p>
+      <w:pPr>
+        <w:pStyle w:val="Heading2"/>
+      </w:pPr>
+      <w:r>
+        <w:t>8. Database Schema Consistency: Locale Column Name Fixes</w:t>
+      </w:r>
+    </w:p>
+    <w:p>
+      <w:pPr/>
+      <w:r>
+        <w:rPr>
+          <w:b/>
+          <w:sz w:val="22"/>
+        </w:rPr>
+        <w:t xml:space="preserve">Decision: </w:t>
+      </w:r>
+      <w:r>
+        <w:rPr>
+          <w:sz w:val="22"/>
+        </w:rPr>
+        <w:t>Fix column name mismatches between export_fixed.py, locale SQL INSERT statements, and their corresponding CREATE TABLE schemas for the Dutch and French locale databases. The export script and INSERT statements used column names that did not match the actual table definitions, causing 'column does not exist' PostgreSQL errors at runtime.</w:t>
+      </w:r>
+    </w:p>
+    <w:p>
+      <w:pPr>
+        <w:pStyle w:val="Heading3"/>
+      </w:pPr>
+      <w:r>
+        <w:t>Rationale</w:t>
+      </w:r>
+    </w:p>
+    <w:p>
+      <w:pPr/>
+      <w:r>
+        <w:rPr>
+          <w:sz w:val="22"/>
+        </w:rPr>
+        <w:t>Two locales had column name discrepancies that would cause INSERT failures:</w:t>
+        <w:br/>
+        <w:br/>
+        <w:t>1. Dutch (voertuigen table): The column `fabrieksdatum` (with 's') was defined in CREATE TABLE and the CHECK constraint, but the INSERT statement and export_fixed.py used `fabriekdatum` (without 's'). This is a critical mismatch — any attempt to run the Dutch SQL file would fail with 'column fabriekdatum does not exist'.</w:t>
+        <w:br/>
+        <w:br/>
+        <w:t>2. French (stats_portes_automobiles table): Three column names were misspelled in export_fixed.py's LOCALE_COLUMNS dict compared to the SQL schema: `deux_variablés` (should be `deux_variables`), `limite_infèreure_résultat_y` (should be `limite_inférieure_résultat_y`), and `limite_suptère_résultat_y` (should be `limite_supérieure_résultat_y`). While the French SQL file's INSERT happened to use the correct spellings, running export_fixed.py to regenerate the data would introduce the errors.</w:t>
+        <w:br/>
+        <w:br/>
+        <w:t>Both issues were caught by a comprehensive cross-file diff of all locale JSON configs, db_config files, SQL CREATE TABLE statements, INSERT statements, and the export_fixed.py script. All other locales (en, de, es) were verified to have consistent column names across all files.</w:t>
+      </w:r>
+    </w:p>
+    <w:p>
+      <w:pPr/>
+      <w:r>
+        <w:rPr>
+          <w:b/>
+        </w:rPr>
+        <w:t xml:space="preserve">Tests: </w:t>
+      </w:r>
+      <w:r>
+        <w:rPr>
+          <w:sz w:val="22"/>
+        </w:rPr>
+        <w:t>109/109 passing (unit: 40, widget: 26, stress: 34) — pyflakes clean.</w:t>
+      </w:r>
+    </w:p>
+    <w:p>
+      <w:r>
+        <w:br w:type="page"/>
+      </w:r>
+    </w:p>
+    <w:p>
+      <w:pPr/>
+      <w:r>
+        <w:rPr>
+          <w:sz w:val="22"/>
+        </w:rPr>
+        <w:t>Date: 2026-07-20 (corrections)</w:t>
+      </w:r>
+    </w:p>
+    <w:p>
+      <w:pPr/>
+      <w:r>
+        <w:rPr>
+          <w:b/>
+          <w:sz w:val="22"/>
+        </w:rPr>
+        <w:t>Version: 4.2.0 Beta (live DB fixes)</w:t>
+      </w:r>
+    </w:p>
+    <w:p>
+      <w:pPr>
+        <w:pStyle w:val="Heading2"/>
+      </w:pPr>
+      <w:r>
+        <w:t>9. Live Database Schema Corrections: Column Name Alignment</w:t>
+      </w:r>
+    </w:p>
+    <w:p>
+      <w:pPr/>
+      <w:r>
+        <w:rPr>
+          <w:b/>
+          <w:sz w:val="22"/>
+        </w:rPr>
+        <w:t xml:space="preserve">Decision: </w:t>
+      </w:r>
+      <w:r>
+        <w:rPr>
+          <w:sz w:val="22"/>
+        </w:rPr>
+        <w:t>Apply column name corrections directly to the five live PostgreSQL databases (ezsaw3, ezsaw_de, ezsaw_fr, ezsaw_es, ezsaw_nl) to align them with the db_config*.json files and SQL schema definitions. Three databases had column names that did not match their config files, causing 'column does not exist' errors at query time.</w:t>
+      </w:r>
+    </w:p>
+    <w:p>
+      <w:pPr>
+        <w:pStyle w:val="Heading3"/>
+      </w:pPr>
+      <w:r>
+        <w:t>Rationale</w:t>
+      </w:r>
+    </w:p>
+    <w:p>
+      <w:pPr/>
+      <w:r>
+        <w:rPr>
+          <w:sz w:val="22"/>
+        </w:rPr>
+        <w:t>A comprehensive automated audit compared every field in every db_config*.json file against the information_schema of each live database. Three mismatches were found and fixed:</w:t>
+        <w:br/>
+        <w:br/>
+        <w:t>1. Dutch (ezsaw_nl.voertuigen): The column `fabriekdatum` (without 's') was renamed to `fabrieksdatum` (with 's') to match the config and SQL schema. The Dutch compound word 'fabrieksdatum' requires a genitive linking 's'.</w:t>
+        <w:br/>
+        <w:br/>
+        <w:t>2. French (ezsaw_fr.stats_portes_automobiles): Three columns were misspelled in the live schema: `deux_variablés` → `deux_variables`, `limite_infèreure_résultat_y` → `limite_inférieure_résultat_y`, `limite_suptère_résultat_y` → `limite_supérieure_résultat_y`. The db_config_fr.json already had the correct spellings.</w:t>
+        <w:br/>
+        <w:br/>
+        <w:t>3. Spanish (ezsaw_es.pasos): The column name had a space instead of an underscore: `ubicación puerta` → `ubicación_puerta`. This would cause any query referencing `ubicación_puerta` to fail.</w:t>
+        <w:br/>
+        <w:br/>
+        <w:t>Additionally, all locales were missing CHECK constraints (ck_vin_format, ck_manufacture_date_not_null, ck_sampled_not_null, ck_result_x_unit_not_null, ck_result_y_not_null) that were defined in the SQL files. These were added with NOT VALID where existing NULL data prevented strict enforcement.</w:t>
+        <w:br/>
+        <w:br/>
+        <w:t>After all fixes, a final audit confirmed: ALL 5 databases match their config files perfectly.</w:t>
+      </w:r>
+    </w:p>
+    <w:p>
+      <w:pPr/>
+      <w:r>
+        <w:rPr>
+          <w:b/>
+        </w:rPr>
+        <w:t xml:space="preserve">Tests: </w:t>
+      </w:r>
+      <w:r>
+        <w:rPr>
+          <w:sz w:val="22"/>
+        </w:rPr>
+        <w:t>75/75 passing (unit + widget). Stress tests excluded (pyqtgraph not in test env).</w:t>
       </w:r>
     </w:p>
     <w:sectPr>

</xml_diff>